<commit_message>
update-checking about in 2020 birth data file how complete it is ; not at least one variable is missing
</commit_message>
<xml_diff>
--- a/notebooks/2020_Birth/First Stage 2020/01_birth_records_quality_report.docx
+++ b/notebooks/2020_Birth/First Stage 2020/01_birth_records_quality_report.docx
@@ -13,7 +13,7 @@
     </w:p>
     <w:p>
       <w:r>
-        <w:t>Generated: 2026-03-29 09:07</w:t>
+        <w:t>Generated: 2026-03-29 12:03</w:t>
       </w:r>
     </w:p>
     <w:p>
@@ -1399,7 +1399,7 @@
           </w:tcPr>
           <w:p>
             <w:r>
-              <w:t>int64</w:t>
+              <w:t>str</w:t>
             </w:r>
           </w:p>
         </w:tc>

</xml_diff>